<commit_message>
Paula QS Parte 3: revisão
Co-Authored-By: Claude Opus 5.5 <noreply@anthropic.com>
Claude-Session: https://claude.ai/code/session_01MJjUEEZrxQDEUifKK2vj9g
</commit_message>
<xml_diff>
--- a/roteiros/paula-fernandes-2/PaulaQS_Parte3.docx
+++ b/roteiros/paula-fernandes-2/PaulaQS_Parte3.docx
@@ -415,7 +415,7 @@
         <w:rPr>
           <w:color w:val="000000"/>
         </w:rPr>
-        <w:t>Lembra dos duzentos e vinte shows? De cada três reais de cachê, quase um ficava em outro lugar.</w:t>
+        <w:t>Agora volte àqueles duzentos e vinte shows. De cada três reais de cachê, quase um ficava em outro lugar.</w:t>
       </w:r>
     </w:p>
     <w:p>
@@ -455,7 +455,7 @@
         <w:rPr>
           <w:color w:val="000000"/>
         </w:rPr>
-        <w:t>No dia vinte e cinco de setembro, a Justiça derrubou a liminar. A Talismã mandou um comunicado à imprensa avisando que continuava responsável pela carreira dela.</w:t>
+        <w:t>No dia vinte e cinco de setembro, a Talismã mandou um comunicado à imprensa. A Justiça tinha derrubado a liminar, e o escritório continuava responsável pela carreira dela.</w:t>
       </w:r>
     </w:p>
     <w:p>
@@ -471,7 +471,7 @@
         <w:rPr>
           <w:color w:val="000000"/>
         </w:rPr>
-        <w:t>A cantora mais famosa do Brasil tinha ido à Justiça para se libertar. E tinha perdido.</w:t>
+        <w:t>Uma das cantoras mais famosas do Brasil tinha ido à Justiça para se libertar. E tinha perdido.</w:t>
       </w:r>
     </w:p>
     <w:p>
@@ -511,7 +511,7 @@
         <w:rPr>
           <w:color w:val="000000"/>
         </w:rPr>
-        <w:t>A partir daí, cada tropeço de Paula Fernandes passou a ser tratado como um escândalo.</w:t>
+        <w:t>Com o rótulo de antipática colado nela, cada tropeço de Paula Fernandes passou a ser tratado como um escândalo.</w:t>
       </w:r>
     </w:p>
     <w:p>

</xml_diff>